<commit_message>
Add faculty and remove reviewer field from report title page
</commit_message>
<xml_diff>
--- a/Звіт_ЛР2_Генетичні_алгоритми.docx
+++ b/Звіт_ЛР2_Генетичні_алгоритми.docx
@@ -16,6 +16,14 @@
       </w:pPr>
       <w:r>
         <w:t>Київський національний університет імені Тараса Шевченка</w:t>
+      </w:r>
+    </w:p>
+    <w:p>
+      <w:pPr>
+        <w:jc w:val="center"/>
+      </w:pPr>
+      <w:r>
+        <w:t>Факультет комп’ютерних наук та кібернетики</w:t>
       </w:r>
     </w:p>
     <w:p>
@@ -100,20 +108,9 @@
     </w:p>
     <w:p>
       <w:pPr>
-        <w:jc w:val="right"/>
-      </w:pPr>
-      <w:r>
-        <w:t>Перевірив(ла): [посада, науковий ступінь]</w:t>
-      </w:r>
-    </w:p>
-    <w:p>
-      <w:pPr>
         <w:spacing w:after="3000"/>
         <w:jc w:val="right"/>
       </w:pPr>
-      <w:r>
-        <w:t>[Прізвище І. П.]</w:t>
-      </w:r>
     </w:p>
     <w:p>
       <w:pPr>

</xml_diff>